<commit_message>
change in word file
</commit_message>
<xml_diff>
--- a/סיכום פרויקט לא סופי.docx
+++ b/סיכום פרויקט לא סופי.docx
@@ -1987,32 +1987,1452 @@
           <w:lang w:bidi="he-IL"/>
         </w:rPr>
       </w:pPr>
+      <w:r>
+        <w:rPr>
+          <w:rFonts w:cs="Arial" w:hint="cs"/>
+          <w:rtl/>
+          <w:lang w:bidi="he-IL"/>
+        </w:rPr>
+        <w:t>ניתן לתאר את בעיית האופטימיזצי</w:t>
+      </w:r>
+      <w:r>
+        <w:rPr>
+          <w:rFonts w:cs="Arial"/>
+          <w:rtl/>
+          <w:lang w:bidi="he-IL"/>
+        </w:rPr>
+        <w:t>ה</w:t>
+      </w:r>
+      <w:r>
+        <w:rPr>
+          <w:rFonts w:cs="Arial" w:hint="cs"/>
+          <w:rtl/>
+          <w:lang w:bidi="he-IL"/>
+        </w:rPr>
+        <w:t xml:space="preserve"> באופן הבא:</w:t>
+      </w:r>
     </w:p>
     <w:p>
       <w:pPr>
-        <w:bidi/>
-        <w:rPr>
-          <w:rFonts w:cs="Arial"/>
-          <w:rtl/>
-          <w:lang w:bidi="he-IL"/>
-        </w:rPr>
-      </w:pPr>
-      <w:r>
-        <w:rPr>
-          <w:rFonts w:cs="Arial" w:hint="cs"/>
-          <w:highlight w:val="yellow"/>
-          <w:rtl/>
-          <w:lang w:bidi="he-IL"/>
-        </w:rPr>
-        <w:t>לרשום את משוואה 25</w:t>
-      </w:r>
+        <w:rPr>
+          <w:rFonts w:cs="Arial"/>
+          <w:lang w:bidi="he-IL"/>
+        </w:rPr>
+      </w:pPr>
+      <m:oMathPara>
+        <m:oMath>
+          <m:d>
+            <m:dPr>
+              <m:ctrlPr>
+                <w:rPr>
+                  <w:rFonts w:ascii="Cambria Math" w:hAnsi="Cambria Math" w:cs="Arial"/>
+                  <w:i/>
+                  <w:lang w:bidi="he-IL"/>
+                </w:rPr>
+              </m:ctrlPr>
+            </m:dPr>
+            <m:e>
+              <m:r>
+                <w:rPr>
+                  <w:rFonts w:ascii="Cambria Math" w:hAnsi="Cambria Math" w:cs="Arial"/>
+                  <w:lang w:bidi="he-IL"/>
+                </w:rPr>
+                <m:t>25a</m:t>
+              </m:r>
+            </m:e>
+          </m:d>
+          <m:r>
+            <w:rPr>
+              <w:rFonts w:ascii="Cambria Math" w:hAnsi="Cambria Math" w:cs="Arial"/>
+              <w:lang w:bidi="he-IL"/>
+            </w:rPr>
+            <m:t xml:space="preserve">,  </m:t>
+          </m:r>
+          <m:func>
+            <m:funcPr>
+              <m:ctrlPr>
+                <w:rPr>
+                  <w:rFonts w:ascii="Cambria Math" w:hAnsi="Cambria Math" w:cs="Arial"/>
+                  <w:i/>
+                  <w:lang w:bidi="he-IL"/>
+                </w:rPr>
+              </m:ctrlPr>
+            </m:funcPr>
+            <m:fName>
+              <m:limLow>
+                <m:limLowPr>
+                  <m:ctrlPr>
+                    <w:rPr>
+                      <w:rFonts w:ascii="Cambria Math" w:hAnsi="Cambria Math" w:cs="Arial"/>
+                      <w:i/>
+                      <w:lang w:bidi="he-IL"/>
+                    </w:rPr>
+                  </m:ctrlPr>
+                </m:limLowPr>
+                <m:e>
+                  <m:r>
+                    <m:rPr>
+                      <m:sty m:val="p"/>
+                    </m:rPr>
+                    <w:rPr>
+                      <w:rFonts w:ascii="Cambria Math" w:hAnsi="Cambria Math" w:cs="Arial"/>
+                      <w:lang w:bidi="he-IL"/>
+                    </w:rPr>
+                    <m:t>min</m:t>
+                  </m:r>
+                </m:e>
+                <m:lim>
+                  <m:sSubSup>
+                    <m:sSubSupPr>
+                      <m:ctrlPr>
+                        <w:rPr>
+                          <w:rFonts w:ascii="Cambria Math" w:hAnsi="Cambria Math" w:cs="Arial"/>
+                          <w:i/>
+                          <w:lang w:bidi="he-IL"/>
+                        </w:rPr>
+                      </m:ctrlPr>
+                    </m:sSubSupPr>
+                    <m:e>
+                      <m:d>
+                        <m:dPr>
+                          <m:ctrlPr>
+                            <w:rPr>
+                              <w:rFonts w:ascii="Cambria Math" w:hAnsi="Cambria Math" w:cs="Arial"/>
+                              <w:i/>
+                              <w:lang w:bidi="he-IL"/>
+                            </w:rPr>
+                          </m:ctrlPr>
+                        </m:dPr>
+                        <m:e>
+                          <m:sSub>
+                            <m:sSubPr>
+                              <m:ctrlPr>
+                                <w:rPr>
+                                  <w:rFonts w:ascii="Cambria Math" w:hAnsi="Cambria Math" w:cs="Arial"/>
+                                  <w:i/>
+                                  <w:lang w:bidi="he-IL"/>
+                                </w:rPr>
+                              </m:ctrlPr>
+                            </m:sSubPr>
+                            <m:e>
+                              <m:r>
+                                <m:rPr>
+                                  <m:sty m:val="bi"/>
+                                </m:rPr>
+                                <w:rPr>
+                                  <w:rFonts w:ascii="Cambria Math" w:hAnsi="Cambria Math" w:cs="Arial"/>
+                                  <w:lang w:bidi="he-IL"/>
+                                </w:rPr>
+                                <m:t>w</m:t>
+                              </m:r>
+                            </m:e>
+                            <m:sub>
+                              <m:r>
+                                <w:rPr>
+                                  <w:rFonts w:ascii="Cambria Math" w:hAnsi="Cambria Math" w:cs="Arial"/>
+                                  <w:lang w:bidi="he-IL"/>
+                                </w:rPr>
+                                <m:t>f</m:t>
+                              </m:r>
+                            </m:sub>
+                          </m:sSub>
+                          <m:r>
+                            <w:rPr>
+                              <w:rFonts w:ascii="Cambria Math" w:hAnsi="Cambria Math" w:cs="Arial"/>
+                              <w:lang w:bidi="he-IL"/>
+                            </w:rPr>
+                            <m:t>,</m:t>
+                          </m:r>
+                          <m:sSub>
+                            <m:sSubPr>
+                              <m:ctrlPr>
+                                <w:rPr>
+                                  <w:rFonts w:ascii="Cambria Math" w:hAnsi="Cambria Math" w:cs="Arial"/>
+                                  <w:i/>
+                                  <w:lang w:bidi="he-IL"/>
+                                </w:rPr>
+                              </m:ctrlPr>
+                            </m:sSubPr>
+                            <m:e>
+                              <m:r>
+                                <w:rPr>
+                                  <w:rFonts w:ascii="Cambria Math" w:hAnsi="Cambria Math" w:cs="Arial"/>
+                                  <w:lang w:bidi="he-IL"/>
+                                </w:rPr>
+                                <m:t>z</m:t>
+                              </m:r>
+                            </m:e>
+                            <m:sub>
+                              <m:r>
+                                <w:rPr>
+                                  <w:rFonts w:ascii="Cambria Math" w:hAnsi="Cambria Math" w:cs="Arial"/>
+                                  <w:lang w:bidi="he-IL"/>
+                                </w:rPr>
+                                <m:t>f</m:t>
+                              </m:r>
+                            </m:sub>
+                          </m:sSub>
+                        </m:e>
+                      </m:d>
+                    </m:e>
+                    <m:sub>
+                      <m:r>
+                        <w:rPr>
+                          <w:rFonts w:ascii="Cambria Math" w:hAnsi="Cambria Math" w:cs="Arial"/>
+                          <w:lang w:bidi="he-IL"/>
+                        </w:rPr>
+                        <m:t>f=0</m:t>
+                      </m:r>
+                    </m:sub>
+                    <m:sup>
+                      <m:r>
+                        <w:rPr>
+                          <w:rFonts w:ascii="Cambria Math" w:hAnsi="Cambria Math" w:cs="Arial"/>
+                          <w:lang w:bidi="he-IL"/>
+                        </w:rPr>
+                        <m:t>F-1</m:t>
+                      </m:r>
+                    </m:sup>
+                  </m:sSubSup>
+                  <m:ctrlPr>
+                    <w:rPr>
+                      <w:rFonts w:ascii="Cambria Math" w:hAnsi="Cambria Math" w:cs="Arial"/>
+                      <w:lang w:bidi="he-IL"/>
+                    </w:rPr>
+                  </m:ctrlPr>
+                </m:lim>
+              </m:limLow>
+            </m:fName>
+            <m:e>
+              <m:nary>
+                <m:naryPr>
+                  <m:chr m:val="∑"/>
+                  <m:ctrlPr>
+                    <w:rPr>
+                      <w:rFonts w:ascii="Cambria Math" w:hAnsi="Cambria Math" w:cs="Arial"/>
+                      <w:i/>
+                      <w:lang w:bidi="he-IL"/>
+                    </w:rPr>
+                  </m:ctrlPr>
+                </m:naryPr>
+                <m:sub>
+                  <m:r>
+                    <w:rPr>
+                      <w:rFonts w:ascii="Cambria Math" w:hAnsi="Cambria Math" w:cs="Arial"/>
+                      <w:lang w:bidi="he-IL"/>
+                    </w:rPr>
+                    <m:t>f=0</m:t>
+                  </m:r>
+                </m:sub>
+                <m:sup>
+                  <m:r>
+                    <w:rPr>
+                      <w:rFonts w:ascii="Cambria Math" w:hAnsi="Cambria Math" w:cs="Arial"/>
+                      <w:lang w:bidi="he-IL"/>
+                    </w:rPr>
+                    <m:t>F-1</m:t>
+                  </m:r>
+                </m:sup>
+                <m:e>
+                  <m:sSubSup>
+                    <m:sSubSupPr>
+                      <m:ctrlPr>
+                        <w:rPr>
+                          <w:rFonts w:ascii="Cambria Math" w:hAnsi="Cambria Math" w:cs="Arial"/>
+                          <w:i/>
+                          <w:lang w:bidi="he-IL"/>
+                        </w:rPr>
+                      </m:ctrlPr>
+                    </m:sSubSupPr>
+                    <m:e>
+                      <m:r>
+                        <m:rPr>
+                          <m:sty m:val="bi"/>
+                        </m:rPr>
+                        <w:rPr>
+                          <w:rFonts w:ascii="Cambria Math" w:hAnsi="Cambria Math" w:cs="Arial"/>
+                          <w:lang w:bidi="he-IL"/>
+                        </w:rPr>
+                        <m:t>w</m:t>
+                      </m:r>
+                      <m:ctrlPr>
+                        <w:rPr>
+                          <w:rFonts w:ascii="Cambria Math" w:hAnsi="Cambria Math" w:cs="Arial"/>
+                          <w:b/>
+                          <w:bCs/>
+                          <w:i/>
+                          <w:lang w:bidi="he-IL"/>
+                        </w:rPr>
+                      </m:ctrlPr>
+                    </m:e>
+                    <m:sub>
+                      <m:r>
+                        <w:rPr>
+                          <w:rFonts w:ascii="Cambria Math" w:hAnsi="Cambria Math" w:cs="Arial"/>
+                          <w:lang w:bidi="he-IL"/>
+                        </w:rPr>
+                        <m:t>f</m:t>
+                      </m:r>
+                    </m:sub>
+                    <m:sup>
+                      <m:r>
+                        <w:rPr>
+                          <w:rFonts w:ascii="Cambria Math" w:hAnsi="Cambria Math" w:cs="Arial"/>
+                          <w:lang w:bidi="he-IL"/>
+                        </w:rPr>
+                        <m:t>H</m:t>
+                      </m:r>
+                    </m:sup>
+                  </m:sSubSup>
+                  <m:sSub>
+                    <m:sSubPr>
+                      <m:ctrlPr>
+                        <w:rPr>
+                          <w:rFonts w:ascii="Cambria Math" w:hAnsi="Cambria Math" w:cs="Arial"/>
+                          <w:i/>
+                          <w:lang w:bidi="he-IL"/>
+                        </w:rPr>
+                      </m:ctrlPr>
+                    </m:sSubPr>
+                    <m:e>
+                      <m:r>
+                        <w:rPr>
+                          <w:rFonts w:ascii="Cambria Math" w:hAnsi="Cambria Math" w:cs="Arial"/>
+                          <w:lang w:bidi="he-IL"/>
+                        </w:rPr>
+                        <m:t>R</m:t>
+                      </m:r>
+                    </m:e>
+                    <m:sub>
+                      <m:r>
+                        <w:rPr>
+                          <w:rFonts w:ascii="Cambria Math" w:hAnsi="Cambria Math" w:cs="Arial"/>
+                          <w:lang w:bidi="he-IL"/>
+                        </w:rPr>
+                        <m:t>f</m:t>
+                      </m:r>
+                    </m:sub>
+                  </m:sSub>
+                  <m:sSub>
+                    <m:sSubPr>
+                      <m:ctrlPr>
+                        <w:rPr>
+                          <w:rFonts w:ascii="Cambria Math" w:hAnsi="Cambria Math" w:cs="Arial"/>
+                          <w:i/>
+                          <w:lang w:bidi="he-IL"/>
+                        </w:rPr>
+                      </m:ctrlPr>
+                    </m:sSubPr>
+                    <m:e>
+                      <m:r>
+                        <m:rPr>
+                          <m:sty m:val="bi"/>
+                        </m:rPr>
+                        <w:rPr>
+                          <w:rFonts w:ascii="Cambria Math" w:hAnsi="Cambria Math" w:cs="Arial"/>
+                          <w:lang w:bidi="he-IL"/>
+                        </w:rPr>
+                        <m:t>w</m:t>
+                      </m:r>
+                      <m:ctrlPr>
+                        <w:rPr>
+                          <w:rFonts w:ascii="Cambria Math" w:hAnsi="Cambria Math" w:cs="Arial"/>
+                          <w:b/>
+                          <w:bCs/>
+                          <w:i/>
+                          <w:lang w:bidi="he-IL"/>
+                        </w:rPr>
+                      </m:ctrlPr>
+                    </m:e>
+                    <m:sub>
+                      <m:r>
+                        <w:rPr>
+                          <w:rFonts w:ascii="Cambria Math" w:hAnsi="Cambria Math" w:cs="Arial"/>
+                          <w:lang w:bidi="he-IL"/>
+                        </w:rPr>
+                        <m:t>f</m:t>
+                      </m:r>
+                    </m:sub>
+                  </m:sSub>
+                </m:e>
+              </m:nary>
+            </m:e>
+          </m:func>
+        </m:oMath>
+      </m:oMathPara>
     </w:p>
     <w:p>
       <w:pPr>
+        <w:rPr>
+          <w:rFonts w:cs="Arial"/>
+          <w:rtl/>
+          <w:lang w:bidi="he-IL"/>
+        </w:rPr>
+      </w:pPr>
+      <m:oMathPara>
+        <m:oMath>
+          <m:d>
+            <m:dPr>
+              <m:ctrlPr>
+                <w:rPr>
+                  <w:rFonts w:ascii="Cambria Math" w:hAnsi="Cambria Math" w:cs="Arial"/>
+                  <w:i/>
+                  <w:lang w:bidi="he-IL"/>
+                </w:rPr>
+              </m:ctrlPr>
+            </m:dPr>
+            <m:e>
+              <m:r>
+                <w:rPr>
+                  <w:rFonts w:ascii="Cambria Math" w:hAnsi="Cambria Math" w:cs="Arial"/>
+                  <w:lang w:bidi="he-IL"/>
+                </w:rPr>
+                <m:t>25b</m:t>
+              </m:r>
+            </m:e>
+          </m:d>
+          <m:r>
+            <w:rPr>
+              <w:rFonts w:ascii="Cambria Math" w:hAnsi="Cambria Math" w:cs="Arial"/>
+              <w:lang w:bidi="he-IL"/>
+            </w:rPr>
+            <m:t xml:space="preserve">,  s.t.          </m:t>
+          </m:r>
+          <m:sSubSup>
+            <m:sSubSupPr>
+              <m:ctrlPr>
+                <w:rPr>
+                  <w:rFonts w:ascii="Cambria Math" w:hAnsi="Cambria Math" w:cs="Arial"/>
+                  <w:i/>
+                  <w:lang w:bidi="he-IL"/>
+                </w:rPr>
+              </m:ctrlPr>
+            </m:sSubSupPr>
+            <m:e>
+              <m:r>
+                <m:rPr>
+                  <m:sty m:val="bi"/>
+                </m:rPr>
+                <w:rPr>
+                  <w:rFonts w:ascii="Cambria Math" w:hAnsi="Cambria Math" w:cs="Arial"/>
+                  <w:lang w:bidi="he-IL"/>
+                </w:rPr>
+                <m:t>w</m:t>
+              </m:r>
+            </m:e>
+            <m:sub>
+              <m:r>
+                <w:rPr>
+                  <w:rFonts w:ascii="Cambria Math" w:hAnsi="Cambria Math" w:cs="Arial"/>
+                  <w:lang w:bidi="he-IL"/>
+                </w:rPr>
+                <m:t>f</m:t>
+              </m:r>
+            </m:sub>
+            <m:sup>
+              <m:r>
+                <w:rPr>
+                  <w:rFonts w:ascii="Cambria Math" w:hAnsi="Cambria Math" w:cs="Arial"/>
+                  <w:lang w:bidi="he-IL"/>
+                </w:rPr>
+                <m:t>H</m:t>
+              </m:r>
+            </m:sup>
+          </m:sSubSup>
+          <m:sSub>
+            <m:sSubPr>
+              <m:ctrlPr>
+                <w:rPr>
+                  <w:rFonts w:ascii="Cambria Math" w:hAnsi="Cambria Math" w:cs="Arial"/>
+                  <w:i/>
+                  <w:lang w:bidi="he-IL"/>
+                </w:rPr>
+              </m:ctrlPr>
+            </m:sSubPr>
+            <m:e>
+              <m:r>
+                <m:rPr>
+                  <m:sty m:val="bi"/>
+                </m:rPr>
+                <w:rPr>
+                  <w:rFonts w:ascii="Cambria Math" w:hAnsi="Cambria Math" w:cs="Arial"/>
+                  <w:lang w:bidi="he-IL"/>
+                </w:rPr>
+                <m:t>a</m:t>
+              </m:r>
+              <m:ctrlPr>
+                <w:rPr>
+                  <w:rFonts w:ascii="Cambria Math" w:hAnsi="Cambria Math" w:cs="Arial"/>
+                  <w:b/>
+                  <w:bCs/>
+                  <w:i/>
+                  <w:lang w:bidi="he-IL"/>
+                </w:rPr>
+              </m:ctrlPr>
+            </m:e>
+            <m:sub>
+              <m:r>
+                <w:rPr>
+                  <w:rFonts w:ascii="Cambria Math" w:hAnsi="Cambria Math" w:cs="Arial"/>
+                  <w:lang w:bidi="he-IL"/>
+                </w:rPr>
+                <m:t>f</m:t>
+              </m:r>
+            </m:sub>
+          </m:sSub>
+          <m:r>
+            <w:rPr>
+              <w:rFonts w:ascii="Cambria Math" w:hAnsi="Cambria Math" w:cs="Arial"/>
+              <w:lang w:bidi="he-IL"/>
+            </w:rPr>
+            <m:t>=1+</m:t>
+          </m:r>
+          <m:sSub>
+            <m:sSubPr>
+              <m:ctrlPr>
+                <w:rPr>
+                  <w:rFonts w:ascii="Cambria Math" w:hAnsi="Cambria Math" w:cs="Arial"/>
+                  <w:i/>
+                  <w:lang w:bidi="he-IL"/>
+                </w:rPr>
+              </m:ctrlPr>
+            </m:sSubPr>
+            <m:e>
+              <m:r>
+                <w:rPr>
+                  <w:rFonts w:ascii="Cambria Math" w:hAnsi="Cambria Math" w:cs="Arial"/>
+                  <w:lang w:bidi="he-IL"/>
+                </w:rPr>
+                <m:t>z</m:t>
+              </m:r>
+            </m:e>
+            <m:sub>
+              <m:r>
+                <w:rPr>
+                  <w:rFonts w:ascii="Cambria Math" w:hAnsi="Cambria Math" w:cs="Arial"/>
+                  <w:lang w:bidi="he-IL"/>
+                </w:rPr>
+                <m:t>f</m:t>
+              </m:r>
+            </m:sub>
+          </m:sSub>
+          <m:r>
+            <w:rPr>
+              <w:rFonts w:ascii="Cambria Math" w:hAnsi="Cambria Math" w:cs="Arial"/>
+              <w:lang w:bidi="he-IL"/>
+            </w:rPr>
+            <m:t xml:space="preserve">  ∀f</m:t>
+          </m:r>
+        </m:oMath>
+      </m:oMathPara>
+    </w:p>
+    <w:p>
+      <w:pPr>
+        <w:rPr>
+          <w:rFonts w:cs="Arial"/>
+          <w:lang w:bidi="he-IL"/>
+        </w:rPr>
+      </w:pPr>
+      <m:oMathPara>
+        <m:oMath>
+          <m:d>
+            <m:dPr>
+              <m:ctrlPr>
+                <w:rPr>
+                  <w:rFonts w:ascii="Cambria Math" w:hAnsi="Cambria Math" w:cs="Arial"/>
+                  <w:i/>
+                  <w:lang w:bidi="he-IL"/>
+                </w:rPr>
+              </m:ctrlPr>
+            </m:dPr>
+            <m:e>
+              <m:r>
+                <w:rPr>
+                  <w:rFonts w:ascii="Cambria Math" w:hAnsi="Cambria Math" w:cs="Arial"/>
+                  <w:lang w:bidi="he-IL"/>
+                </w:rPr>
+                <m:t>25c</m:t>
+              </m:r>
+            </m:e>
+          </m:d>
+          <m:r>
+            <w:rPr>
+              <w:rFonts w:ascii="Cambria Math" w:hAnsi="Cambria Math" w:cs="Arial"/>
+              <w:lang w:bidi="he-IL"/>
+            </w:rPr>
+            <m:t xml:space="preserve">,  </m:t>
+          </m:r>
+          <m:sSub>
+            <m:sSubPr>
+              <m:ctrlPr>
+                <w:rPr>
+                  <w:rFonts w:ascii="Cambria Math" w:hAnsi="Cambria Math" w:cs="Arial"/>
+                  <w:i/>
+                  <w:lang w:bidi="he-IL"/>
+                </w:rPr>
+              </m:ctrlPr>
+            </m:sSubPr>
+            <m:e>
+              <m:r>
+                <w:rPr>
+                  <w:rFonts w:ascii="Cambria Math" w:hAnsi="Cambria Math" w:cs="Arial"/>
+                  <w:lang w:bidi="he-IL"/>
+                </w:rPr>
+                <m:t>z</m:t>
+              </m:r>
+            </m:e>
+            <m:sub>
+              <m:r>
+                <w:rPr>
+                  <w:rFonts w:ascii="Cambria Math" w:hAnsi="Cambria Math" w:cs="Arial"/>
+                  <w:lang w:bidi="he-IL"/>
+                </w:rPr>
+                <m:t>f</m:t>
+              </m:r>
+            </m:sub>
+          </m:sSub>
+          <m:r>
+            <w:rPr>
+              <w:rFonts w:ascii="Cambria Math" w:hAnsi="Cambria Math" w:cs="Arial"/>
+              <w:lang w:bidi="he-IL"/>
+            </w:rPr>
+            <m:t>≥0  ∀f</m:t>
+          </m:r>
+        </m:oMath>
+      </m:oMathPara>
+    </w:p>
+    <w:p>
+      <w:pPr>
+        <w:rPr>
+          <w:rFonts w:cs="Arial"/>
+          <w:lang w:bidi="he-IL"/>
+        </w:rPr>
+      </w:pPr>
+      <m:oMathPara>
+        <m:oMath>
+          <m:d>
+            <m:dPr>
+              <m:ctrlPr>
+                <w:rPr>
+                  <w:rFonts w:ascii="Cambria Math" w:hAnsi="Cambria Math" w:cs="Arial"/>
+                  <w:i/>
+                  <w:lang w:bidi="he-IL"/>
+                </w:rPr>
+              </m:ctrlPr>
+            </m:dPr>
+            <m:e>
+              <m:r>
+                <w:rPr>
+                  <w:rFonts w:ascii="Cambria Math" w:hAnsi="Cambria Math" w:cs="Arial"/>
+                  <w:lang w:bidi="he-IL"/>
+                </w:rPr>
+                <m:t>25d</m:t>
+              </m:r>
+            </m:e>
+          </m:d>
+          <m:r>
+            <w:rPr>
+              <w:rFonts w:ascii="Cambria Math" w:hAnsi="Cambria Math" w:cs="Arial"/>
+              <w:lang w:bidi="he-IL"/>
+            </w:rPr>
+            <m:t xml:space="preserve">,  </m:t>
+          </m:r>
+          <m:sSub>
+            <m:sSubPr>
+              <m:ctrlPr>
+                <w:rPr>
+                  <w:rFonts w:ascii="Cambria Math" w:hAnsi="Cambria Math" w:cs="Arial"/>
+                  <w:i/>
+                  <w:lang w:bidi="he-IL"/>
+                </w:rPr>
+              </m:ctrlPr>
+            </m:sSubPr>
+            <m:e>
+              <m:d>
+                <m:dPr>
+                  <m:ctrlPr>
+                    <w:rPr>
+                      <w:rFonts w:ascii="Cambria Math" w:hAnsi="Cambria Math" w:cs="Arial"/>
+                      <w:i/>
+                      <w:lang w:bidi="he-IL"/>
+                    </w:rPr>
+                  </m:ctrlPr>
+                </m:dPr>
+                <m:e>
+                  <m:sSup>
+                    <m:sSupPr>
+                      <m:ctrlPr>
+                        <w:rPr>
+                          <w:rFonts w:ascii="Cambria Math" w:hAnsi="Cambria Math" w:cs="Arial"/>
+                          <w:i/>
+                          <w:lang w:bidi="he-IL"/>
+                        </w:rPr>
+                      </m:ctrlPr>
+                    </m:sSupPr>
+                    <m:e>
+                      <m:r>
+                        <w:rPr>
+                          <w:rFonts w:ascii="Cambria Math" w:hAnsi="Cambria Math" w:cs="Arial"/>
+                          <w:lang w:bidi="he-IL"/>
+                        </w:rPr>
+                        <m:t>D</m:t>
+                      </m:r>
+                    </m:e>
+                    <m:sup>
+                      <m:r>
+                        <w:rPr>
+                          <w:rFonts w:ascii="Cambria Math" w:hAnsi="Cambria Math" w:cs="Arial"/>
+                          <w:lang w:bidi="he-IL"/>
+                        </w:rPr>
+                        <m:t>-1</m:t>
+                      </m:r>
+                    </m:sup>
+                  </m:sSup>
+                  <m:sSup>
+                    <m:sSupPr>
+                      <m:ctrlPr>
+                        <w:rPr>
+                          <w:rFonts w:ascii="Cambria Math" w:hAnsi="Cambria Math" w:cs="Arial"/>
+                          <w:i/>
+                          <w:lang w:bidi="he-IL"/>
+                        </w:rPr>
+                      </m:ctrlPr>
+                    </m:sSupPr>
+                    <m:e>
+                      <m:d>
+                        <m:dPr>
+                          <m:begChr m:val="["/>
+                          <m:endChr m:val="]"/>
+                          <m:ctrlPr>
+                            <w:rPr>
+                              <w:rFonts w:ascii="Cambria Math" w:hAnsi="Cambria Math" w:cs="Arial"/>
+                              <w:i/>
+                              <w:lang w:bidi="he-IL"/>
+                            </w:rPr>
+                          </m:ctrlPr>
+                        </m:dPr>
+                        <m:e>
+                          <m:sSub>
+                            <m:sSubPr>
+                              <m:ctrlPr>
+                                <w:rPr>
+                                  <w:rFonts w:ascii="Cambria Math" w:hAnsi="Cambria Math" w:cs="Arial"/>
+                                  <w:i/>
+                                  <w:lang w:bidi="he-IL"/>
+                                </w:rPr>
+                              </m:ctrlPr>
+                            </m:sSubPr>
+                            <m:e>
+                              <m:r>
+                                <w:rPr>
+                                  <w:rFonts w:ascii="Cambria Math" w:hAnsi="Cambria Math" w:cs="Arial"/>
+                                  <w:lang w:bidi="he-IL"/>
+                                </w:rPr>
+                                <m:t>w</m:t>
+                              </m:r>
+                            </m:e>
+                            <m:sub>
+                              <m:r>
+                                <w:rPr>
+                                  <w:rFonts w:ascii="Cambria Math" w:hAnsi="Cambria Math" w:cs="Arial"/>
+                                  <w:lang w:bidi="he-IL"/>
+                                </w:rPr>
+                                <m:t>0,m</m:t>
+                              </m:r>
+                            </m:sub>
+                          </m:sSub>
+                          <m:r>
+                            <w:rPr>
+                              <w:rFonts w:ascii="Cambria Math" w:hAnsi="Cambria Math" w:cs="Arial"/>
+                              <w:lang w:bidi="he-IL"/>
+                            </w:rPr>
+                            <m:t>,…,</m:t>
+                          </m:r>
+                          <m:sSub>
+                            <m:sSubPr>
+                              <m:ctrlPr>
+                                <w:rPr>
+                                  <w:rFonts w:ascii="Cambria Math" w:hAnsi="Cambria Math" w:cs="Arial"/>
+                                  <w:i/>
+                                  <w:lang w:bidi="he-IL"/>
+                                </w:rPr>
+                              </m:ctrlPr>
+                            </m:sSubPr>
+                            <m:e>
+                              <m:r>
+                                <w:rPr>
+                                  <w:rFonts w:ascii="Cambria Math" w:hAnsi="Cambria Math" w:cs="Arial"/>
+                                  <w:lang w:bidi="he-IL"/>
+                                </w:rPr>
+                                <m:t>w</m:t>
+                              </m:r>
+                            </m:e>
+                            <m:sub>
+                              <m:r>
+                                <w:rPr>
+                                  <w:rFonts w:ascii="Cambria Math" w:hAnsi="Cambria Math" w:cs="Arial"/>
+                                  <w:lang w:bidi="he-IL"/>
+                                </w:rPr>
+                                <m:t>F-1,m</m:t>
+                              </m:r>
+                            </m:sub>
+                          </m:sSub>
+                        </m:e>
+                      </m:d>
+                    </m:e>
+                    <m:sup>
+                      <m:r>
+                        <w:rPr>
+                          <w:rFonts w:ascii="Cambria Math" w:hAnsi="Cambria Math" w:cs="Arial"/>
+                          <w:lang w:bidi="he-IL"/>
+                        </w:rPr>
+                        <m:t>H</m:t>
+                      </m:r>
+                    </m:sup>
+                  </m:sSup>
+                </m:e>
+              </m:d>
+            </m:e>
+            <m:sub>
+              <m:r>
+                <w:rPr>
+                  <w:rFonts w:ascii="Cambria Math" w:hAnsi="Cambria Math" w:cs="Arial"/>
+                  <w:lang w:bidi="he-IL"/>
+                </w:rPr>
+                <m:t>n</m:t>
+              </m:r>
+            </m:sub>
+          </m:sSub>
+          <m:r>
+            <w:rPr>
+              <w:rFonts w:ascii="Cambria Math" w:hAnsi="Cambria Math" w:cs="Arial"/>
+              <w:lang w:bidi="he-IL"/>
+            </w:rPr>
+            <m:t>=0,  ∀m,n∉</m:t>
+          </m:r>
+          <m:sSub>
+            <m:sSubPr>
+              <m:ctrlPr>
+                <w:rPr>
+                  <w:rFonts w:ascii="Cambria Math" w:hAnsi="Cambria Math" w:cs="Arial"/>
+                  <w:i/>
+                  <w:lang w:bidi="he-IL"/>
+                </w:rPr>
+              </m:ctrlPr>
+            </m:sSubPr>
+            <m:e>
+              <m:r>
+                <m:rPr>
+                  <m:scr m:val="script"/>
+                </m:rPr>
+                <w:rPr>
+                  <w:rFonts w:ascii="Cambria Math" w:hAnsi="Cambria Math" w:cs="Arial"/>
+                  <w:lang w:bidi="he-IL"/>
+                </w:rPr>
+                <m:t>N</m:t>
+              </m:r>
+            </m:e>
+            <m:sub>
+              <m:r>
+                <w:rPr>
+                  <w:rFonts w:ascii="Cambria Math" w:hAnsi="Cambria Math" w:cs="Arial"/>
+                  <w:lang w:bidi="he-IL"/>
+                </w:rPr>
+                <m:t>δ</m:t>
+              </m:r>
+            </m:sub>
+          </m:sSub>
+        </m:oMath>
+      </m:oMathPara>
+    </w:p>
+    <w:p>
+      <w:pPr>
         <w:bidi/>
         <w:rPr>
           <w:rFonts w:cs="Arial"/>
           <w:rtl/>
+          <w:lang w:bidi="he-IL"/>
+        </w:rPr>
+      </w:pPr>
+      <w:r>
+        <w:rPr>
+          <w:rFonts w:cs="Arial" w:hint="cs"/>
+          <w:rtl/>
+          <w:lang w:bidi="he-IL"/>
+        </w:rPr>
+        <w:t>כאשר</w:t>
+      </w:r>
+    </w:p>
+    <w:p>
+      <w:pPr>
+        <w:pStyle w:val="ListParagraph"/>
+        <w:numPr>
+          <w:ilvl w:val="0"/>
+          <w:numId w:val="8"/>
+        </w:numPr>
+        <w:bidi/>
+        <w:rPr>
+          <w:rFonts w:cs="Arial"/>
+          <w:lang w:bidi="he-IL"/>
+        </w:rPr>
+      </w:pPr>
+      <m:oMath>
+        <m:sSub>
+          <m:sSubPr>
+            <m:ctrlPr>
+              <w:rPr>
+                <w:rFonts w:ascii="Cambria Math" w:hAnsi="Cambria Math" w:cs="Arial"/>
+                <w:i/>
+                <w:lang w:bidi="he-IL"/>
+              </w:rPr>
+            </m:ctrlPr>
+          </m:sSubPr>
+          <m:e>
+            <m:r>
+              <m:rPr>
+                <m:sty m:val="bi"/>
+              </m:rPr>
+              <w:rPr>
+                <w:rFonts w:ascii="Cambria Math" w:hAnsi="Cambria Math" w:cs="Arial"/>
+                <w:lang w:bidi="he-IL"/>
+              </w:rPr>
+              <m:t>w</m:t>
+            </m:r>
+            <m:ctrlPr>
+              <w:rPr>
+                <w:rFonts w:ascii="Cambria Math" w:hAnsi="Cambria Math" w:cs="Arial"/>
+                <w:b/>
+                <w:bCs/>
+                <w:i/>
+                <w:lang w:bidi="he-IL"/>
+              </w:rPr>
+            </m:ctrlPr>
+          </m:e>
+          <m:sub>
+            <m:r>
+              <w:rPr>
+                <w:rFonts w:ascii="Cambria Math" w:hAnsi="Cambria Math" w:cs="Arial"/>
+                <w:lang w:bidi="he-IL"/>
+              </w:rPr>
+              <m:t>f</m:t>
+            </m:r>
+          </m:sub>
+        </m:sSub>
+        <m:r>
+          <w:rPr>
+            <w:rFonts w:ascii="Cambria Math" w:hAnsi="Cambria Math" w:cs="Arial"/>
+            <w:lang w:bidi="he-IL"/>
+          </w:rPr>
+          <m:t>∈</m:t>
+        </m:r>
+        <m:sSup>
+          <m:sSupPr>
+            <m:ctrlPr>
+              <w:rPr>
+                <w:rFonts w:ascii="Cambria Math" w:hAnsi="Cambria Math" w:cs="Arial"/>
+                <w:i/>
+                <w:lang w:bidi="he-IL"/>
+              </w:rPr>
+            </m:ctrlPr>
+          </m:sSupPr>
+          <m:e>
+            <m:r>
+              <m:rPr>
+                <m:scr m:val="double-struck"/>
+              </m:rPr>
+              <w:rPr>
+                <w:rFonts w:ascii="Cambria Math" w:hAnsi="Cambria Math" w:cs="Arial"/>
+                <w:lang w:bidi="he-IL"/>
+              </w:rPr>
+              <m:t>C</m:t>
+            </m:r>
+          </m:e>
+          <m:sup>
+            <m:r>
+              <w:rPr>
+                <w:rFonts w:ascii="Cambria Math" w:hAnsi="Cambria Math" w:cs="Arial"/>
+                <w:lang w:bidi="he-IL"/>
+              </w:rPr>
+              <m:t>M</m:t>
+            </m:r>
+          </m:sup>
+        </m:sSup>
+      </m:oMath>
+      <w:r>
+        <w:rPr>
+          <w:rFonts w:cs="Arial" w:hint="cs"/>
+          <w:rtl/>
+          <w:lang w:bidi="he-IL"/>
+        </w:rPr>
+        <w:t xml:space="preserve"> מקדמי המסנן המרחבי (</w:t>
+      </w:r>
+      <w:r>
+        <w:rPr>
+          <w:rFonts w:cs="Arial"/>
+          <w:lang w:bidi="he-IL"/>
+        </w:rPr>
+        <w:t>spatial filter</w:t>
+      </w:r>
+      <w:r>
+        <w:rPr>
+          <w:rFonts w:cs="Arial" w:hint="cs"/>
+          <w:rtl/>
+          <w:lang w:bidi="he-IL"/>
+        </w:rPr>
+        <w:t>)</w:t>
+      </w:r>
+    </w:p>
+    <w:p>
+      <w:pPr>
+        <w:pStyle w:val="ListParagraph"/>
+        <w:numPr>
+          <w:ilvl w:val="0"/>
+          <w:numId w:val="8"/>
+        </w:numPr>
+        <w:bidi/>
+        <w:rPr>
+          <w:rFonts w:cs="Arial"/>
+          <w:lang w:bidi="he-IL"/>
+        </w:rPr>
+      </w:pPr>
+      <m:oMath>
+        <m:sSub>
+          <m:sSubPr>
+            <m:ctrlPr>
+              <w:rPr>
+                <w:rFonts w:ascii="Cambria Math" w:hAnsi="Cambria Math" w:cs="Arial"/>
+                <w:i/>
+                <w:lang w:bidi="he-IL"/>
+              </w:rPr>
+            </m:ctrlPr>
+          </m:sSubPr>
+          <m:e>
+            <m:r>
+              <w:rPr>
+                <w:rFonts w:ascii="Cambria Math" w:hAnsi="Cambria Math" w:cs="Arial"/>
+                <w:lang w:bidi="he-IL"/>
+              </w:rPr>
+              <m:t>R</m:t>
+            </m:r>
+          </m:e>
+          <m:sub>
+            <m:r>
+              <w:rPr>
+                <w:rFonts w:ascii="Cambria Math" w:hAnsi="Cambria Math" w:cs="Arial"/>
+                <w:lang w:bidi="he-IL"/>
+              </w:rPr>
+              <m:t>f</m:t>
+            </m:r>
+          </m:sub>
+        </m:sSub>
+        <m:r>
+          <w:rPr>
+            <w:rFonts w:ascii="Cambria Math" w:hAnsi="Cambria Math" w:cs="Arial"/>
+            <w:lang w:bidi="he-IL"/>
+          </w:rPr>
+          <m:t>∈</m:t>
+        </m:r>
+        <m:sSup>
+          <m:sSupPr>
+            <m:ctrlPr>
+              <w:rPr>
+                <w:rFonts w:ascii="Cambria Math" w:hAnsi="Cambria Math" w:cs="Arial"/>
+                <w:i/>
+                <w:lang w:bidi="he-IL"/>
+              </w:rPr>
+            </m:ctrlPr>
+          </m:sSupPr>
+          <m:e>
+            <m:r>
+              <m:rPr>
+                <m:scr m:val="double-struck"/>
+              </m:rPr>
+              <w:rPr>
+                <w:rFonts w:ascii="Cambria Math" w:hAnsi="Cambria Math" w:cs="Arial"/>
+                <w:lang w:bidi="he-IL"/>
+              </w:rPr>
+              <m:t>C</m:t>
+            </m:r>
+          </m:e>
+          <m:sup>
+            <m:r>
+              <w:rPr>
+                <w:rFonts w:ascii="Cambria Math" w:hAnsi="Cambria Math" w:cs="Arial"/>
+                <w:lang w:bidi="he-IL"/>
+              </w:rPr>
+              <m:t>M×M</m:t>
+            </m:r>
+          </m:sup>
+        </m:sSup>
+      </m:oMath>
+      <w:r>
+        <w:rPr>
+          <w:rFonts w:cs="Arial" w:hint="cs"/>
+          <w:rtl/>
+          <w:lang w:bidi="he-IL"/>
+        </w:rPr>
+        <w:t xml:space="preserve"> ה- </w:t>
+      </w:r>
+      <w:r>
+        <w:rPr>
+          <w:rFonts w:cs="Arial"/>
+          <w:lang w:bidi="he-IL"/>
+        </w:rPr>
+        <w:t>SCM</w:t>
+      </w:r>
+      <w:r>
+        <w:rPr>
+          <w:rFonts w:cs="Arial" w:hint="cs"/>
+          <w:rtl/>
+          <w:lang w:bidi="he-IL"/>
+        </w:rPr>
+        <w:t xml:space="preserve"> (</w:t>
+      </w:r>
+      <w:r>
+        <w:rPr>
+          <w:rFonts w:cs="Arial"/>
+          <w:lang w:bidi="he-IL"/>
+        </w:rPr>
+        <w:t>spatial covariance matrix</w:t>
+      </w:r>
+      <w:r>
+        <w:rPr>
+          <w:rFonts w:cs="Arial" w:hint="cs"/>
+          <w:rtl/>
+          <w:lang w:bidi="he-IL"/>
+        </w:rPr>
+        <w:t>)</w:t>
+      </w:r>
+    </w:p>
+    <w:p>
+      <w:pPr>
+        <w:pStyle w:val="ListParagraph"/>
+        <w:numPr>
+          <w:ilvl w:val="0"/>
+          <w:numId w:val="8"/>
+        </w:numPr>
+        <w:bidi/>
+        <w:rPr>
+          <w:rFonts w:cs="Arial"/>
+          <w:lang w:bidi="he-IL"/>
+        </w:rPr>
+      </w:pPr>
+      <m:oMath>
+        <m:sSub>
+          <m:sSubPr>
+            <m:ctrlPr>
+              <w:rPr>
+                <w:rFonts w:ascii="Cambria Math" w:hAnsi="Cambria Math" w:cs="Arial"/>
+                <w:i/>
+                <w:lang w:bidi="he-IL"/>
+              </w:rPr>
+            </m:ctrlPr>
+          </m:sSubPr>
+          <m:e>
+            <m:r>
+              <w:rPr>
+                <w:rFonts w:ascii="Cambria Math" w:hAnsi="Cambria Math" w:cs="Arial"/>
+                <w:lang w:bidi="he-IL"/>
+              </w:rPr>
+              <m:t>a</m:t>
+            </m:r>
+          </m:e>
+          <m:sub>
+            <m:r>
+              <w:rPr>
+                <w:rFonts w:ascii="Cambria Math" w:hAnsi="Cambria Math" w:cs="Arial"/>
+                <w:lang w:bidi="he-IL"/>
+              </w:rPr>
+              <m:t>f</m:t>
+            </m:r>
+          </m:sub>
+        </m:sSub>
+        <m:r>
+          <w:rPr>
+            <w:rFonts w:ascii="Cambria Math" w:hAnsi="Cambria Math" w:cs="Arial"/>
+            <w:lang w:bidi="he-IL"/>
+          </w:rPr>
+          <m:t>∈</m:t>
+        </m:r>
+        <m:sSup>
+          <m:sSupPr>
+            <m:ctrlPr>
+              <w:rPr>
+                <w:rFonts w:ascii="Cambria Math" w:hAnsi="Cambria Math" w:cs="Arial"/>
+                <w:i/>
+                <w:lang w:bidi="he-IL"/>
+              </w:rPr>
+            </m:ctrlPr>
+          </m:sSupPr>
+          <m:e>
+            <m:r>
+              <m:rPr>
+                <m:scr m:val="double-struck"/>
+              </m:rPr>
+              <w:rPr>
+                <w:rFonts w:ascii="Cambria Math" w:hAnsi="Cambria Math" w:cs="Arial"/>
+                <w:lang w:bidi="he-IL"/>
+              </w:rPr>
+              <m:t>C</m:t>
+            </m:r>
+          </m:e>
+          <m:sup>
+            <m:r>
+              <w:rPr>
+                <w:rFonts w:ascii="Cambria Math" w:hAnsi="Cambria Math" w:cs="Arial"/>
+                <w:lang w:bidi="he-IL"/>
+              </w:rPr>
+              <m:t>M</m:t>
+            </m:r>
+          </m:sup>
+        </m:sSup>
+      </m:oMath>
+      <w:r>
+        <w:rPr>
+          <w:rFonts w:cs="Arial" w:hint="cs"/>
+          <w:rtl/>
+          <w:lang w:bidi="he-IL"/>
+        </w:rPr>
+        <w:t xml:space="preserve"> וקטור ה- </w:t>
+      </w:r>
+      <w:r>
+        <w:rPr>
+          <w:rFonts w:cs="Arial"/>
+          <w:lang w:bidi="he-IL"/>
+        </w:rPr>
+        <w:t>RTF</w:t>
+      </w:r>
+      <w:r>
+        <w:rPr>
+          <w:rFonts w:cs="Arial" w:hint="cs"/>
+          <w:rtl/>
+          <w:lang w:bidi="he-IL"/>
+        </w:rPr>
+        <w:t xml:space="preserve"> (</w:t>
+      </w:r>
+      <w:r>
+        <w:rPr>
+          <w:rFonts w:cs="Arial"/>
+          <w:lang w:bidi="he-IL"/>
+        </w:rPr>
+        <w:t>relative transfer function</w:t>
+      </w:r>
+      <w:r>
+        <w:rPr>
+          <w:rFonts w:cs="Arial" w:hint="cs"/>
+          <w:rtl/>
+          <w:lang w:bidi="he-IL"/>
+        </w:rPr>
+        <w:t>)</w:t>
+      </w:r>
+    </w:p>
+    <w:p>
+      <w:pPr>
+        <w:pStyle w:val="ListParagraph"/>
+        <w:numPr>
+          <w:ilvl w:val="0"/>
+          <w:numId w:val="8"/>
+        </w:numPr>
+        <w:bidi/>
+        <w:rPr>
+          <w:rFonts w:cs="Arial"/>
+          <w:lang w:bidi="he-IL"/>
+        </w:rPr>
+      </w:pPr>
+      <m:oMath>
+        <m:sSub>
+          <m:sSubPr>
+            <m:ctrlPr>
+              <w:rPr>
+                <w:rFonts w:ascii="Cambria Math" w:hAnsi="Cambria Math" w:cs="Arial"/>
+                <w:i/>
+                <w:lang w:bidi="he-IL"/>
+              </w:rPr>
+            </m:ctrlPr>
+          </m:sSubPr>
+          <m:e>
+            <m:r>
+              <w:rPr>
+                <w:rFonts w:ascii="Cambria Math" w:hAnsi="Cambria Math" w:cs="Arial"/>
+                <w:lang w:bidi="he-IL"/>
+              </w:rPr>
+              <m:t>z</m:t>
+            </m:r>
+          </m:e>
+          <m:sub>
+            <m:r>
+              <w:rPr>
+                <w:rFonts w:ascii="Cambria Math" w:hAnsi="Cambria Math" w:cs="Arial"/>
+                <w:lang w:bidi="he-IL"/>
+              </w:rPr>
+              <m:t>f</m:t>
+            </m:r>
+          </m:sub>
+        </m:sSub>
+      </m:oMath>
+      <w:r>
+        <w:rPr>
+          <w:rFonts w:cs="Arial" w:hint="cs"/>
+          <w:rtl/>
+          <w:lang w:bidi="he-IL"/>
+        </w:rPr>
+        <w:t xml:space="preserve"> </w:t>
+      </w:r>
+      <w:r>
+        <w:rPr>
+          <w:rFonts w:cs="Arial"/>
+          <w:rtl/>
+          <w:lang w:bidi="he-IL"/>
+        </w:rPr>
+        <w:t>–</w:t>
+      </w:r>
+      <w:r>
+        <w:rPr>
+          <w:rFonts w:cs="Arial" w:hint="cs"/>
+          <w:rtl/>
+          <w:lang w:bidi="he-IL"/>
+        </w:rPr>
+        <w:t xml:space="preserve"> פרמטרי ה- </w:t>
+      </w:r>
+      <w:r>
+        <w:rPr>
+          <w:rFonts w:cs="Arial"/>
+          <w:lang w:bidi="he-IL"/>
+        </w:rPr>
+        <w:t>gain</w:t>
+      </w:r>
+      <w:r>
+        <w:rPr>
+          <w:rFonts w:cs="Arial" w:hint="cs"/>
+          <w:rtl/>
+          <w:lang w:bidi="he-IL"/>
+        </w:rPr>
+        <w:t xml:space="preserve"> המוגבלים להיות ערכים לא שליליים ומייצגים את ההקלה בתנאי חוסר העיוות</w:t>
+      </w:r>
+      <w:r>
+        <w:rPr>
+          <w:rFonts w:cs="Arial" w:hint="cs"/>
+          <w:rtl/>
+          <w:lang w:bidi="he-IL"/>
+        </w:rPr>
+        <w:t>.</w:t>
+      </w:r>
+    </w:p>
+    <w:p>
+      <w:pPr>
+        <w:pStyle w:val="ListParagraph"/>
+        <w:numPr>
+          <w:ilvl w:val="0"/>
+          <w:numId w:val="8"/>
+        </w:numPr>
+        <w:bidi/>
+        <w:rPr>
+          <w:rFonts w:cs="Arial"/>
+          <w:lang w:bidi="he-IL"/>
+        </w:rPr>
+      </w:pPr>
+      <m:oMath>
+        <m:sSub>
+          <m:sSubPr>
+            <m:ctrlPr>
+              <w:rPr>
+                <w:rFonts w:ascii="Cambria Math" w:hAnsi="Cambria Math" w:cs="Arial"/>
+                <w:i/>
+                <w:lang w:bidi="he-IL"/>
+              </w:rPr>
+            </m:ctrlPr>
+          </m:sSubPr>
+          <m:e>
+            <m:r>
+              <w:rPr>
+                <w:rFonts w:ascii="Cambria Math" w:hAnsi="Cambria Math" w:cs="Arial"/>
+                <w:lang w:bidi="he-IL"/>
+              </w:rPr>
+              <m:t>N</m:t>
+            </m:r>
+          </m:e>
+          <m:sub>
+            <m:r>
+              <w:rPr>
+                <w:rFonts w:ascii="Cambria Math" w:hAnsi="Cambria Math" w:cs="Arial"/>
+                <w:lang w:bidi="he-IL"/>
+              </w:rPr>
+              <m:t>δ</m:t>
+            </m:r>
+          </m:sub>
+        </m:sSub>
+        <m:r>
+          <w:rPr>
+            <w:rFonts w:ascii="Cambria Math" w:hAnsi="Cambria Math" w:cs="Arial"/>
+            <w:lang w:bidi="he-IL"/>
+          </w:rPr>
+          <m:t>=</m:t>
+        </m:r>
+        <m:d>
+          <m:dPr>
+            <m:begChr m:val="["/>
+            <m:endChr m:val="]"/>
+            <m:ctrlPr>
+              <w:rPr>
+                <w:rFonts w:ascii="Cambria Math" w:hAnsi="Cambria Math" w:cs="Arial"/>
+                <w:i/>
+                <w:lang w:bidi="he-IL"/>
+              </w:rPr>
+            </m:ctrlPr>
+          </m:dPr>
+          <m:e>
+            <m:r>
+              <w:rPr>
+                <w:rFonts w:ascii="Cambria Math" w:hAnsi="Cambria Math" w:cs="Arial"/>
+                <w:lang w:bidi="he-IL"/>
+              </w:rPr>
+              <m:t>-δ,</m:t>
+            </m:r>
+            <m:f>
+              <m:fPr>
+                <m:ctrlPr>
+                  <w:rPr>
+                    <w:rFonts w:ascii="Cambria Math" w:hAnsi="Cambria Math" w:cs="Arial"/>
+                    <w:i/>
+                    <w:lang w:bidi="he-IL"/>
+                  </w:rPr>
+                </m:ctrlPr>
+              </m:fPr>
+              <m:num>
+                <m:r>
+                  <w:rPr>
+                    <w:rFonts w:ascii="Cambria Math" w:hAnsi="Cambria Math" w:cs="Arial"/>
+                    <w:lang w:bidi="he-IL"/>
+                  </w:rPr>
+                  <m:t>F</m:t>
+                </m:r>
+              </m:num>
+              <m:den>
+                <m:r>
+                  <w:rPr>
+                    <w:rFonts w:ascii="Cambria Math" w:hAnsi="Cambria Math" w:cs="Arial"/>
+                    <w:lang w:bidi="he-IL"/>
+                  </w:rPr>
+                  <m:t>2</m:t>
+                </m:r>
+              </m:den>
+            </m:f>
+            <m:r>
+              <w:rPr>
+                <w:rFonts w:ascii="Cambria Math" w:hAnsi="Cambria Math" w:cs="Arial"/>
+                <w:lang w:bidi="he-IL"/>
+              </w:rPr>
+              <m:t>-1</m:t>
+            </m:r>
+          </m:e>
+        </m:d>
+      </m:oMath>
+    </w:p>
+    <w:p>
+      <w:pPr>
+        <w:bidi/>
+        <w:rPr>
+          <w:rFonts w:cs="Arial"/>
           <w:lang w:bidi="he-IL"/>
         </w:rPr>
       </w:pPr>
@@ -2313,7 +3733,6 @@
           <w:rtl/>
           <w:lang w:bidi="he-IL"/>
         </w:rPr>
-        <w:lastRenderedPageBreak/>
         <w:t xml:space="preserve">המאמר מציג הרחבה לפתרון על ידי שימוש בשיטת </w:t>
       </w:r>
       <w:r>
@@ -3473,23 +4892,7 @@
           <w:rtl/>
           <w:lang w:bidi="he-IL"/>
         </w:rPr>
-        <w:t>נשרטט אות</w:t>
-      </w:r>
-      <w:r>
-        <w:rPr>
-          <w:rFonts w:hint="cs"/>
-          <w:rtl/>
-          <w:lang w:bidi="he-IL"/>
-        </w:rPr>
-        <w:t xml:space="preserve"> דובר לדוגמה</w:t>
-      </w:r>
-      <w:r>
-        <w:rPr>
-          <w:rFonts w:hint="cs"/>
-          <w:rtl/>
-          <w:lang w:bidi="he-IL"/>
-        </w:rPr>
-        <w:t xml:space="preserve"> בציר הזמן:</w:t>
+        <w:t>נשרטט אות דובר לדוגמה בציר הזמן:</w:t>
       </w:r>
     </w:p>
     <w:p>
@@ -3586,15 +4989,7 @@
           <w:rtl/>
           <w:lang w:bidi="he-IL"/>
         </w:rPr>
-        <w:t xml:space="preserve"> המתאים</w:t>
-      </w:r>
-      <w:r>
-        <w:rPr>
-          <w:rFonts w:hint="cs"/>
-          <w:rtl/>
-          <w:lang w:bidi="he-IL"/>
-        </w:rPr>
-        <w:t>:</w:t>
+        <w:t xml:space="preserve"> המתאים:</w:t>
       </w:r>
     </w:p>
     <w:p>
@@ -3701,15 +5096,7 @@
           <w:lang w:bidi="he-IL"/>
         </w:rPr>
         <w:lastRenderedPageBreak/>
-        <w:t>נשרטט את תגובת התדר במישור הזמן</w:t>
-      </w:r>
-      <w:r>
-        <w:rPr>
-          <w:rFonts w:hint="cs"/>
-          <w:rtl/>
-          <w:lang w:bidi="he-IL"/>
-        </w:rPr>
-        <w:t xml:space="preserve"> שהתקבלה לאחר ערך מוגרל לזמן ההדהוד:</w:t>
+        <w:t>נשרטט את תגובת התדר במישור הזמן שהתקבלה לאחר ערך מוגרל לזמן ההדהוד:</w:t>
       </w:r>
     </w:p>
     <w:p>
@@ -4052,6 +5439,7 @@
       <w:r>
         <w:rPr>
           <w:rFonts w:cs="Arial"/>
+          <w:noProof/>
           <w:rtl/>
           <w:lang w:bidi="he-IL"/>
         </w:rPr>
@@ -4334,7 +5722,7 @@
       <w:pPr>
         <w:bidi/>
         <w:rPr>
-          <w:rFonts w:cs="Arial" w:hint="cs"/>
+          <w:rFonts w:cs="Arial"/>
           <w:i/>
           <w:rtl/>
           <w:lang w:bidi="he-IL"/>
@@ -4344,6 +5732,7 @@
         <w:rPr>
           <w:rFonts w:cs="Arial"/>
           <w:i/>
+          <w:noProof/>
           <w:rtl/>
           <w:lang w:bidi="he-IL"/>
         </w:rPr>
@@ -4886,7 +6275,7 @@
         <w:pStyle w:val="ListParagraph"/>
         <w:bidi/>
         <w:rPr>
-          <w:rFonts w:cs="Arial" w:hint="cs"/>
+          <w:rFonts w:cs="Arial"/>
           <w:rtl/>
           <w:lang w:bidi="he-IL"/>
         </w:rPr>
@@ -4938,7 +6327,7 @@
         <w:pStyle w:val="ListParagraph"/>
         <w:bidi/>
         <w:rPr>
-          <w:rFonts w:cs="Arial" w:hint="cs"/>
+          <w:rFonts w:cs="Arial"/>
           <w:rtl/>
           <w:lang w:bidi="he-IL"/>
         </w:rPr>
@@ -5026,7 +6415,6 @@
       <w:pPr>
         <w:bidi/>
         <w:rPr>
-          <w:rFonts w:hint="cs"/>
           <w:rtl/>
           <w:lang w:bidi="he-IL"/>
         </w:rPr>
@@ -5092,7 +6480,7 @@
       <w:pPr>
         <w:bidi/>
         <w:rPr>
-          <w:rFonts w:cs="Arial" w:hint="cs"/>
+          <w:rFonts w:cs="Arial"/>
           <w:i/>
           <w:u w:val="single"/>
           <w:rtl/>
@@ -5143,15 +6531,7 @@
           <w:rtl/>
           <w:lang w:bidi="he-IL"/>
         </w:rPr>
-        <w:t xml:space="preserve"> את </w:t>
-      </w:r>
-      <w:r>
-        <w:rPr>
-          <w:rFonts w:cs="Arial" w:hint="cs"/>
-          <w:rtl/>
-          <w:lang w:bidi="he-IL"/>
-        </w:rPr>
-        <w:t>מקדמי המסנן המרחבי (</w:t>
+        <w:t xml:space="preserve"> את מקדמי המסנן המרחבי (</w:t>
       </w:r>
       <w:r>
         <w:rPr>
@@ -5166,15 +6546,7 @@
           <w:rtl/>
           <w:lang w:bidi="he-IL"/>
         </w:rPr>
-        <w:t>)</w:t>
-      </w:r>
-      <w:r>
-        <w:rPr>
-          <w:rFonts w:cs="Arial" w:hint="cs"/>
-          <w:rtl/>
-          <w:lang w:bidi="he-IL"/>
-        </w:rPr>
-        <w:t xml:space="preserve">, המתעדכנים במהלך אלגוריתם ה- </w:t>
+        <w:t xml:space="preserve">), המתעדכנים במהלך אלגוריתם ה- </w:t>
       </w:r>
       <w:r>
         <w:rPr>
@@ -6292,7 +7664,7 @@
       <w:pPr>
         <w:bidi/>
         <w:rPr>
-          <w:rFonts w:cs="Arial" w:hint="cs"/>
+          <w:rFonts w:cs="Arial"/>
           <w:rtl/>
           <w:lang w:bidi="he-IL"/>
         </w:rPr>
@@ -6986,6 +8358,118 @@
       </w:pPr>
       <w:rPr>
         <w:rFonts w:ascii="Symbol" w:eastAsiaTheme="minorEastAsia" w:hAnsi="Symbol" w:cs="Arial" w:hint="default"/>
+      </w:rPr>
+    </w:lvl>
+    <w:lvl w:ilvl="1" w:tplc="04090003" w:tentative="1">
+      <w:start w:val="1"/>
+      <w:numFmt w:val="bullet"/>
+      <w:lvlText w:val="o"/>
+      <w:lvlJc w:val="left"/>
+      <w:pPr>
+        <w:ind w:left="1440" w:hanging="360"/>
+      </w:pPr>
+      <w:rPr>
+        <w:rFonts w:ascii="Courier New" w:hAnsi="Courier New" w:cs="Courier New" w:hint="default"/>
+      </w:rPr>
+    </w:lvl>
+    <w:lvl w:ilvl="2" w:tplc="04090005" w:tentative="1">
+      <w:start w:val="1"/>
+      <w:numFmt w:val="bullet"/>
+      <w:lvlText w:val=""/>
+      <w:lvlJc w:val="left"/>
+      <w:pPr>
+        <w:ind w:left="2160" w:hanging="360"/>
+      </w:pPr>
+      <w:rPr>
+        <w:rFonts w:ascii="Wingdings" w:hAnsi="Wingdings" w:hint="default"/>
+      </w:rPr>
+    </w:lvl>
+    <w:lvl w:ilvl="3" w:tplc="04090001" w:tentative="1">
+      <w:start w:val="1"/>
+      <w:numFmt w:val="bullet"/>
+      <w:lvlText w:val=""/>
+      <w:lvlJc w:val="left"/>
+      <w:pPr>
+        <w:ind w:left="2880" w:hanging="360"/>
+      </w:pPr>
+      <w:rPr>
+        <w:rFonts w:ascii="Symbol" w:hAnsi="Symbol" w:hint="default"/>
+      </w:rPr>
+    </w:lvl>
+    <w:lvl w:ilvl="4" w:tplc="04090003" w:tentative="1">
+      <w:start w:val="1"/>
+      <w:numFmt w:val="bullet"/>
+      <w:lvlText w:val="o"/>
+      <w:lvlJc w:val="left"/>
+      <w:pPr>
+        <w:ind w:left="3600" w:hanging="360"/>
+      </w:pPr>
+      <w:rPr>
+        <w:rFonts w:ascii="Courier New" w:hAnsi="Courier New" w:cs="Courier New" w:hint="default"/>
+      </w:rPr>
+    </w:lvl>
+    <w:lvl w:ilvl="5" w:tplc="04090005" w:tentative="1">
+      <w:start w:val="1"/>
+      <w:numFmt w:val="bullet"/>
+      <w:lvlText w:val=""/>
+      <w:lvlJc w:val="left"/>
+      <w:pPr>
+        <w:ind w:left="4320" w:hanging="360"/>
+      </w:pPr>
+      <w:rPr>
+        <w:rFonts w:ascii="Wingdings" w:hAnsi="Wingdings" w:hint="default"/>
+      </w:rPr>
+    </w:lvl>
+    <w:lvl w:ilvl="6" w:tplc="04090001" w:tentative="1">
+      <w:start w:val="1"/>
+      <w:numFmt w:val="bullet"/>
+      <w:lvlText w:val=""/>
+      <w:lvlJc w:val="left"/>
+      <w:pPr>
+        <w:ind w:left="5040" w:hanging="360"/>
+      </w:pPr>
+      <w:rPr>
+        <w:rFonts w:ascii="Symbol" w:hAnsi="Symbol" w:hint="default"/>
+      </w:rPr>
+    </w:lvl>
+    <w:lvl w:ilvl="7" w:tplc="04090003" w:tentative="1">
+      <w:start w:val="1"/>
+      <w:numFmt w:val="bullet"/>
+      <w:lvlText w:val="o"/>
+      <w:lvlJc w:val="left"/>
+      <w:pPr>
+        <w:ind w:left="5760" w:hanging="360"/>
+      </w:pPr>
+      <w:rPr>
+        <w:rFonts w:ascii="Courier New" w:hAnsi="Courier New" w:cs="Courier New" w:hint="default"/>
+      </w:rPr>
+    </w:lvl>
+    <w:lvl w:ilvl="8" w:tplc="04090005" w:tentative="1">
+      <w:start w:val="1"/>
+      <w:numFmt w:val="bullet"/>
+      <w:lvlText w:val=""/>
+      <w:lvlJc w:val="left"/>
+      <w:pPr>
+        <w:ind w:left="6480" w:hanging="360"/>
+      </w:pPr>
+      <w:rPr>
+        <w:rFonts w:ascii="Wingdings" w:hAnsi="Wingdings" w:hint="default"/>
+      </w:rPr>
+    </w:lvl>
+  </w:abstractNum>
+  <w:abstractNum w:abstractNumId="7" w15:restartNumberingAfterBreak="0">
+    <w:nsid w:val="78047904"/>
+    <w:multiLevelType w:val="hybridMultilevel"/>
+    <w:tmpl w:val="790EB34E"/>
+    <w:lvl w:ilvl="0" w:tplc="20082658">
+      <w:numFmt w:val="bullet"/>
+      <w:lvlText w:val="-"/>
+      <w:lvlJc w:val="left"/>
+      <w:pPr>
+        <w:ind w:left="720" w:hanging="360"/>
+      </w:pPr>
+      <w:rPr>
+        <w:rFonts w:ascii="Arial" w:eastAsiaTheme="minorEastAsia" w:hAnsi="Arial" w:cs="Arial" w:hint="default"/>
       </w:rPr>
     </w:lvl>
     <w:lvl w:ilvl="1" w:tplc="04090003" w:tentative="1">
@@ -7105,6 +8589,9 @@
   </w:num>
   <w:num w:numId="7" w16cid:durableId="2107723360">
     <w:abstractNumId w:val="6"/>
+  </w:num>
+  <w:num w:numId="8" w16cid:durableId="1369573479">
+    <w:abstractNumId w:val="7"/>
   </w:num>
 </w:numbering>
 </file>

</xml_diff>